<commit_message>
Updated Week 4 LogBook
</commit_message>
<xml_diff>
--- a/Docs/Log Book.docx
+++ b/Docs/Log Book.docx
@@ -872,17 +872,28 @@
         <w:jc w:val="center"/>
         <w:rPr>
           <w:rFonts w:eastAsia="Times New Roman"/>
+          <w:b/>
+          <w:bCs/>
           <w:lang w:eastAsia="en-GB"/>
         </w:rPr>
       </w:pPr>
       <w:r>
         <w:rPr>
           <w:rFonts w:eastAsia="Times New Roman"/>
+          <w:b/>
+          <w:bCs/>
           <w:lang w:eastAsia="en-GB"/>
         </w:rPr>
         <w:lastRenderedPageBreak/>
         <w:t>Week 3: Data Preparation, Baseline Model and App Development</w:t>
       </w:r>
+    </w:p>
+    <w:p>
+      <w:pPr>
+        <w:rPr>
+          <w:lang w:eastAsia="en-GB"/>
+        </w:rPr>
+      </w:pPr>
     </w:p>
     <w:p>
       <w:pPr>
@@ -1155,8 +1166,6 @@
         <w:rPr>
           <w:rFonts w:eastAsia="Times New Roman" w:cs="Times New Roman"/>
           <w:kern w:val="0"/>
-          <w:sz w:val="24"/>
-          <w:szCs w:val="24"/>
           <w:lang w:eastAsia="en-GB"/>
           <w14:ligatures w14:val="none"/>
         </w:rPr>
@@ -1165,8 +1174,6 @@
         <w:rPr>
           <w:rFonts w:eastAsia="Times New Roman" w:cs="Times New Roman"/>
           <w:kern w:val="0"/>
-          <w:sz w:val="24"/>
-          <w:szCs w:val="24"/>
           <w:lang w:eastAsia="en-GB"/>
           <w14:ligatures w14:val="none"/>
         </w:rPr>
@@ -1183,8 +1190,6 @@
         <w:rPr>
           <w:rFonts w:eastAsia="Times New Roman" w:cs="Times New Roman"/>
           <w:kern w:val="0"/>
-          <w:sz w:val="24"/>
-          <w:szCs w:val="24"/>
           <w:lang w:eastAsia="en-GB"/>
           <w14:ligatures w14:val="none"/>
         </w:rPr>
@@ -1193,36 +1198,10 @@
         <w:rPr>
           <w:rFonts w:eastAsia="Times New Roman" w:cs="Times New Roman"/>
           <w:kern w:val="0"/>
-          <w:sz w:val="24"/>
-          <w:szCs w:val="24"/>
           <w:lang w:eastAsia="en-GB"/>
           <w14:ligatures w14:val="none"/>
         </w:rPr>
-        <w:t xml:space="preserve">Deployed the model on the Raspberry Pi 5, achieving a median inference time of around 3 </w:t>
-      </w:r>
-      <w:proofErr w:type="spellStart"/>
-      <w:r>
-        <w:rPr>
-          <w:rFonts w:eastAsia="Times New Roman" w:cs="Times New Roman"/>
-          <w:kern w:val="0"/>
-          <w:sz w:val="24"/>
-          <w:szCs w:val="24"/>
-          <w:lang w:eastAsia="en-GB"/>
-          <w14:ligatures w14:val="none"/>
-        </w:rPr>
-        <w:t>ms</w:t>
-      </w:r>
-      <w:proofErr w:type="spellEnd"/>
-      <w:r>
-        <w:rPr>
-          <w:rFonts w:eastAsia="Times New Roman" w:cs="Times New Roman"/>
-          <w:kern w:val="0"/>
-          <w:sz w:val="24"/>
-          <w:szCs w:val="24"/>
-          <w:lang w:eastAsia="en-GB"/>
-          <w14:ligatures w14:val="none"/>
-        </w:rPr>
-        <w:t>.</w:t>
+        <w:t>Deployed the model on the Raspberry Pi 5, achieving a median inference time of around 3 ms.</w:t>
       </w:r>
     </w:p>
     <w:p>
@@ -1235,8 +1214,6 @@
         <w:rPr>
           <w:rFonts w:eastAsia="Times New Roman" w:cs="Times New Roman"/>
           <w:kern w:val="0"/>
-          <w:sz w:val="24"/>
-          <w:szCs w:val="24"/>
           <w:lang w:eastAsia="en-GB"/>
           <w14:ligatures w14:val="none"/>
         </w:rPr>
@@ -1245,8 +1222,6 @@
         <w:rPr>
           <w:rFonts w:eastAsia="Times New Roman" w:cs="Times New Roman"/>
           <w:kern w:val="0"/>
-          <w:sz w:val="24"/>
-          <w:szCs w:val="24"/>
           <w:lang w:eastAsia="en-GB"/>
           <w14:ligatures w14:val="none"/>
         </w:rPr>
@@ -1263,13 +1238,22 @@
         <w:rPr>
           <w:rFonts w:eastAsia="Times New Roman" w:cs="Times New Roman"/>
           <w:kern w:val="0"/>
-          <w:sz w:val="24"/>
-          <w:szCs w:val="24"/>
           <w:lang w:eastAsia="en-GB"/>
           <w14:ligatures w14:val="none"/>
         </w:rPr>
       </w:pPr>
       <w:r>
+        <w:rPr>
+          <w:rFonts w:eastAsia="Times New Roman" w:cs="Times New Roman"/>
+          <w:kern w:val="0"/>
+          <w:lang w:eastAsia="en-GB"/>
+          <w14:ligatures w14:val="none"/>
+        </w:rPr>
+        <w:t>Tested on real household items and found a domain gap between the dataset’s plain backgrounds and cluttered real-world photos, confirmed through a controlled Pi vs PyTorch comparison.</w:t>
+      </w:r>
+    </w:p>
+    <w:p>
+      <w:pPr>
         <w:rPr>
           <w:rFonts w:eastAsia="Times New Roman" w:cs="Times New Roman"/>
           <w:kern w:val="0"/>
@@ -1278,11 +1262,8 @@
           <w:lang w:eastAsia="en-GB"/>
           <w14:ligatures w14:val="none"/>
         </w:rPr>
-        <w:t>Tested on real household items and found a domain gap between the dataset’s plain backgrounds and cluttered real-world photos, confirmed through a controlled Pi vs PyTorch comparison.</w:t>
-      </w:r>
-    </w:p>
-    <w:p>
-      <w:pPr>
+      </w:pPr>
+      <w:r>
         <w:rPr>
           <w:rFonts w:eastAsia="Times New Roman" w:cs="Times New Roman"/>
           <w:kern w:val="0"/>
@@ -1291,54 +1272,467 @@
           <w:lang w:eastAsia="en-GB"/>
           <w14:ligatures w14:val="none"/>
         </w:rPr>
-      </w:pPr>
-      <w:r>
-        <w:rPr>
-          <w:rFonts w:eastAsia="Times New Roman" w:cs="Times New Roman"/>
-          <w:kern w:val="0"/>
-          <w:sz w:val="24"/>
-          <w:szCs w:val="24"/>
-          <w:lang w:eastAsia="en-GB"/>
-          <w14:ligatures w14:val="none"/>
-        </w:rPr>
         <w:br w:type="page"/>
       </w:r>
     </w:p>
     <w:p>
       <w:pPr>
-        <w:spacing w:before="100" w:beforeAutospacing="1" w:after="100" w:afterAutospacing="1" w:line="240" w:lineRule="auto"/>
-        <w:rPr>
-          <w:rFonts w:eastAsia="Times New Roman" w:cs="Times New Roman"/>
-          <w:kern w:val="0"/>
-          <w:sz w:val="24"/>
-          <w:szCs w:val="24"/>
-          <w:lang w:eastAsia="en-GB"/>
-          <w14:ligatures w14:val="none"/>
-        </w:rPr>
-      </w:pPr>
-    </w:p>
-    <w:p>
-      <w:pPr>
-        <w:rPr>
-          <w:rFonts w:eastAsia="Times New Roman" w:cs="Times New Roman"/>
-          <w:kern w:val="0"/>
-          <w:sz w:val="24"/>
-          <w:szCs w:val="24"/>
-          <w:lang w:eastAsia="en-GB"/>
-          <w14:ligatures w14:val="none"/>
-        </w:rPr>
-      </w:pPr>
-      <w:r>
-        <w:rPr>
-          <w:rFonts w:eastAsia="Times New Roman" w:cs="Times New Roman"/>
-          <w:kern w:val="0"/>
-          <w:sz w:val="24"/>
-          <w:szCs w:val="24"/>
-          <w:lang w:eastAsia="en-GB"/>
-          <w14:ligatures w14:val="none"/>
+        <w:pStyle w:val="Heading1"/>
+        <w:jc w:val="center"/>
+        <w:rPr>
+          <w:rFonts w:eastAsia="Times New Roman"/>
+          <w:b/>
+          <w:bCs/>
+          <w:lang w:eastAsia="en-GB"/>
+        </w:rPr>
+      </w:pPr>
+      <w:r>
+        <w:rPr>
+          <w:rFonts w:eastAsia="Times New Roman"/>
+          <w:b/>
+          <w:bCs/>
+          <w:lang w:eastAsia="en-GB"/>
+        </w:rPr>
+        <w:lastRenderedPageBreak/>
+        <w:t>Week 4: Dataset Expansion and Model Benchmarking</w:t>
+      </w:r>
+    </w:p>
+    <w:p>
+      <w:pPr>
+        <w:rPr>
+          <w:lang w:eastAsia="en-GB"/>
+        </w:rPr>
+      </w:pPr>
+    </w:p>
+    <w:p>
+      <w:pPr>
+        <w:pStyle w:val="Heading2"/>
+        <w:rPr>
+          <w:lang w:eastAsia="en-GB"/>
+        </w:rPr>
+      </w:pPr>
+      <w:r>
+        <w:rPr>
+          <w:lang w:eastAsia="en-GB"/>
+        </w:rPr>
+        <w:t>Part 1: Data Analysis</w:t>
+      </w:r>
+      <w:r>
+        <w:rPr>
+          <w:lang w:eastAsia="en-GB"/>
+        </w:rPr>
+        <w:t xml:space="preserve"> V2</w:t>
+      </w:r>
+      <w:r>
+        <w:rPr>
+          <w:lang w:eastAsia="en-GB"/>
+        </w:rPr>
+        <w:t xml:space="preserve"> (Tanveer)</w:t>
+      </w:r>
+    </w:p>
+    <w:p>
+      <w:pPr>
+        <w:numPr>
+          <w:ilvl w:val="0"/>
+          <w:numId w:val="35"/>
+        </w:numPr>
+        <w:spacing w:after="0"/>
+        <w:rPr>
+          <w:lang w:eastAsia="en-GB"/>
+        </w:rPr>
+      </w:pPr>
+      <w:r>
+        <w:rPr>
+          <w:lang w:eastAsia="en-GB"/>
+        </w:rPr>
+        <w:t xml:space="preserve">Addressed the real-world domain gap found in Week 3 by combining </w:t>
+      </w:r>
+      <w:proofErr w:type="spellStart"/>
+      <w:r>
+        <w:rPr>
+          <w:lang w:eastAsia="en-GB"/>
+        </w:rPr>
+        <w:t>RealWaste</w:t>
+      </w:r>
+      <w:proofErr w:type="spellEnd"/>
+      <w:r>
+        <w:rPr>
+          <w:lang w:eastAsia="en-GB"/>
+        </w:rPr>
+        <w:t xml:space="preserve"> with Garbage Classification v2 and the Garbage Guru dataset, after rejecting unreliable sources.</w:t>
+      </w:r>
+    </w:p>
+    <w:p>
+      <w:pPr>
+        <w:numPr>
+          <w:ilvl w:val="0"/>
+          <w:numId w:val="35"/>
+        </w:numPr>
+        <w:spacing w:after="0"/>
+        <w:rPr>
+          <w:lang w:eastAsia="en-GB"/>
+        </w:rPr>
+      </w:pPr>
+      <w:r>
+        <w:rPr>
+          <w:lang w:eastAsia="en-GB"/>
+        </w:rPr>
+        <w:t>Audited each source in a new Data Analysis 2.0 notebook, finding the Garbage Guru set was about 65% duplicates of Garbage Classification v2.</w:t>
+      </w:r>
+    </w:p>
+    <w:p>
+      <w:pPr>
+        <w:numPr>
+          <w:ilvl w:val="0"/>
+          <w:numId w:val="35"/>
+        </w:numPr>
+        <w:spacing w:after="0"/>
+        <w:rPr>
+          <w:lang w:eastAsia="en-GB"/>
+        </w:rPr>
+      </w:pPr>
+      <w:r>
+        <w:rPr>
+          <w:lang w:eastAsia="en-GB"/>
+        </w:rPr>
+        <w:t>Restructured the labels into eight UK-oriented disposal classes: paper and card, plastic, glass, metal, food and garden, textile, special (batteries and electricals) and general waste.</w:t>
+      </w:r>
+    </w:p>
+    <w:p>
+      <w:pPr>
+        <w:numPr>
+          <w:ilvl w:val="0"/>
+          <w:numId w:val="35"/>
+        </w:numPr>
+        <w:spacing w:after="0"/>
+        <w:rPr>
+          <w:lang w:eastAsia="en-GB"/>
+        </w:rPr>
+      </w:pPr>
+      <w:r>
+        <w:rPr>
+          <w:lang w:eastAsia="en-GB"/>
+        </w:rPr>
+        <w:t>Produced a cleaned dataset of 14,424 standardised 224×224 images, reducing class imbalance from 2.90x to 2.24x.</w:t>
+      </w:r>
+    </w:p>
+    <w:p>
+      <w:pPr>
+        <w:numPr>
+          <w:ilvl w:val="0"/>
+          <w:numId w:val="35"/>
+        </w:numPr>
+        <w:spacing w:after="0"/>
+        <w:rPr>
+          <w:lang w:eastAsia="en-GB"/>
+        </w:rPr>
+      </w:pPr>
+      <w:r>
+        <w:rPr>
+          <w:lang w:eastAsia="en-GB"/>
+        </w:rPr>
+        <w:t>Trained a MobileNetV3-Small benchmark on the new dataset, improving test accuracy from 89.1% to 90.9%.</w:t>
+      </w:r>
+    </w:p>
+    <w:p>
+      <w:pPr>
+        <w:spacing w:after="0"/>
+        <w:rPr>
+          <w:lang w:eastAsia="en-GB"/>
+        </w:rPr>
+      </w:pPr>
+    </w:p>
+    <w:p>
+      <w:pPr>
+        <w:pStyle w:val="Heading2"/>
+        <w:rPr>
+          <w:lang w:eastAsia="en-GB"/>
+        </w:rPr>
+      </w:pPr>
+      <w:r>
+        <w:rPr>
+          <w:lang w:eastAsia="en-GB"/>
+        </w:rPr>
+        <w:t>Part 2: Model Benchmarking</w:t>
+      </w:r>
+    </w:p>
+    <w:p>
+      <w:pPr>
+        <w:pStyle w:val="Heading3"/>
+        <w:rPr>
+          <w:lang w:eastAsia="en-GB"/>
+        </w:rPr>
+      </w:pPr>
+      <w:r>
+        <w:rPr>
+          <w:lang w:eastAsia="en-GB"/>
+        </w:rPr>
+        <w:t>MobileNet benchmark (Smarika)</w:t>
+      </w:r>
+    </w:p>
+    <w:p>
+      <w:pPr>
+        <w:numPr>
+          <w:ilvl w:val="0"/>
+          <w:numId w:val="36"/>
+        </w:numPr>
+        <w:spacing w:after="0"/>
+        <w:rPr>
+          <w:lang w:eastAsia="en-GB"/>
+        </w:rPr>
+      </w:pPr>
+      <w:r>
+        <w:rPr>
+          <w:lang w:eastAsia="en-GB"/>
+        </w:rPr>
+        <w:t>Benchmarked MobileNetV3-Small, MobileNetV3-Large and MobileNetV2 on the merged eight-class dataset.</w:t>
+      </w:r>
+    </w:p>
+    <w:p>
+      <w:pPr>
+        <w:numPr>
+          <w:ilvl w:val="0"/>
+          <w:numId w:val="36"/>
+        </w:numPr>
+        <w:spacing w:after="0"/>
+        <w:rPr>
+          <w:lang w:eastAsia="en-GB"/>
+        </w:rPr>
+      </w:pPr>
+      <w:r>
+        <w:rPr>
+          <w:lang w:eastAsia="en-GB"/>
+        </w:rPr>
+        <w:t>Identified MobileNetV3-Large as the strongest MobileNet model, reaching 93.0% test accuracy.</w:t>
+      </w:r>
+    </w:p>
+    <w:p>
+      <w:pPr>
+        <w:pStyle w:val="Heading3"/>
+        <w:rPr>
+          <w:lang w:eastAsia="en-GB"/>
+        </w:rPr>
+      </w:pPr>
+      <w:r>
+        <w:rPr>
+          <w:lang w:eastAsia="en-GB"/>
+        </w:rPr>
+        <w:t>EfficientNet benchmark (Tanveer)</w:t>
+      </w:r>
+    </w:p>
+    <w:p>
+      <w:pPr>
+        <w:pStyle w:val="ListParagraph"/>
+        <w:numPr>
+          <w:ilvl w:val="0"/>
+          <w:numId w:val="30"/>
+        </w:numPr>
+        <w:rPr>
+          <w:lang w:eastAsia="en-GB"/>
+        </w:rPr>
+      </w:pPr>
+      <w:r>
+        <w:rPr>
+          <w:lang w:eastAsia="en-GB"/>
+        </w:rPr>
+        <w:t>Benchmarked EfficientNet-B0, B1, B2 and Lite0 against MobileNetV3-Large, with test accuracy ranging from 92.1% (Lite0) to 94.5% (B2).</w:t>
+      </w:r>
+    </w:p>
+    <w:p>
+      <w:pPr>
+        <w:pStyle w:val="ListParagraph"/>
+        <w:numPr>
+          <w:ilvl w:val="0"/>
+          <w:numId w:val="30"/>
+        </w:numPr>
+        <w:rPr>
+          <w:lang w:eastAsia="en-GB"/>
+        </w:rPr>
+      </w:pPr>
+      <w:r>
+        <w:rPr>
+          <w:lang w:eastAsia="en-GB"/>
+        </w:rPr>
+        <w:t>Selected EfficientNet-B0 (94.3% accuracy, 16 MB) as VERDE’s vision model, as B2 gained only 0.2 points at nearly twice the size, with MobileNetV3-Large as the fastest alternative.</w:t>
+      </w:r>
+    </w:p>
+    <w:p>
+      <w:pPr>
+        <w:pStyle w:val="Heading3"/>
+        <w:rPr>
+          <w:lang w:eastAsia="en-GB"/>
+        </w:rPr>
+      </w:pPr>
+      <w:r>
+        <w:rPr>
+          <w:lang w:eastAsia="en-GB"/>
+        </w:rPr>
+        <w:t>ResNet benchmark (Sanjeev)</w:t>
+      </w:r>
+    </w:p>
+    <w:p>
+      <w:pPr>
+        <w:numPr>
+          <w:ilvl w:val="0"/>
+          <w:numId w:val="38"/>
+        </w:numPr>
+        <w:spacing w:after="0"/>
+        <w:rPr>
+          <w:lang w:eastAsia="en-GB"/>
+        </w:rPr>
+      </w:pPr>
+      <w:r>
+        <w:rPr>
+          <w:lang w:eastAsia="en-GB"/>
+        </w:rPr>
+        <w:t>Benchmarked ResNet-18, ResNet-34 and ResNet-50 against EfficientNet-B0 and MobileNetV3-Large as reference models.</w:t>
+      </w:r>
+    </w:p>
+    <w:p>
+      <w:pPr>
+        <w:numPr>
+          <w:ilvl w:val="0"/>
+          <w:numId w:val="38"/>
+        </w:numPr>
+        <w:spacing w:after="0"/>
+        <w:rPr>
+          <w:lang w:eastAsia="en-GB"/>
+        </w:rPr>
+      </w:pPr>
+      <w:r>
+        <w:rPr>
+          <w:lang w:eastAsia="en-GB"/>
+        </w:rPr>
+        <w:t>Found the ResNet models did not improve accuracy despite being considerably larger and slower.</w:t>
+      </w:r>
+    </w:p>
+    <w:p>
+      <w:pPr>
+        <w:rPr>
+          <w:lang w:eastAsia="en-GB"/>
+        </w:rPr>
+      </w:pPr>
+    </w:p>
+    <w:p>
+      <w:pPr>
+        <w:pStyle w:val="Heading2"/>
+        <w:rPr>
+          <w:lang w:eastAsia="en-GB"/>
+        </w:rPr>
+      </w:pPr>
+      <w:r>
+        <w:rPr>
+          <w:lang w:eastAsia="en-GB"/>
+        </w:rPr>
+        <w:t xml:space="preserve">Part 3: </w:t>
+      </w:r>
+      <w:r>
+        <w:rPr>
+          <w:lang w:eastAsia="en-GB"/>
+        </w:rPr>
+        <w:t>Raspberry Pi and Edge Setup (Tanveer)</w:t>
+      </w:r>
+    </w:p>
+    <w:p>
+      <w:pPr>
+        <w:numPr>
+          <w:ilvl w:val="0"/>
+          <w:numId w:val="40"/>
+        </w:numPr>
+        <w:spacing w:after="0"/>
+        <w:rPr>
+          <w:lang w:eastAsia="en-GB"/>
+        </w:rPr>
+      </w:pPr>
+      <w:r>
+        <w:rPr>
+          <w:lang w:eastAsia="en-GB"/>
+        </w:rPr>
+        <w:t>Exported EfficientNet-B0 to ExecuTorch with the XNNPACK backend, producing a 16 MB model with the new eight UK disposal classes, ready for deployment on the Pi.</w:t>
+      </w:r>
+    </w:p>
+    <w:p>
+      <w:pPr>
+        <w:numPr>
+          <w:ilvl w:val="0"/>
+          <w:numId w:val="40"/>
+        </w:numPr>
+        <w:spacing w:after="0"/>
+        <w:rPr>
+          <w:lang w:eastAsia="en-GB"/>
+        </w:rPr>
+      </w:pPr>
+      <w:r>
+        <w:rPr>
+          <w:lang w:eastAsia="en-GB"/>
+        </w:rPr>
+        <w:t>Began measuring runtime memory usage of the ExecuTorch model on the Pi.</w:t>
+      </w:r>
+    </w:p>
+    <w:p>
+      <w:pPr>
+        <w:numPr>
+          <w:ilvl w:val="0"/>
+          <w:numId w:val="40"/>
+        </w:numPr>
+        <w:spacing w:after="0"/>
+        <w:rPr>
+          <w:lang w:eastAsia="en-GB"/>
+        </w:rPr>
+      </w:pPr>
+      <w:r>
+        <w:rPr>
+          <w:lang w:eastAsia="en-GB"/>
+        </w:rPr>
+        <w:t>Documented the system architecture and API contract.</w:t>
+      </w:r>
+    </w:p>
+    <w:p>
+      <w:pPr>
+        <w:numPr>
+          <w:ilvl w:val="0"/>
+          <w:numId w:val="40"/>
+        </w:numPr>
+        <w:spacing w:after="0"/>
+        <w:rPr>
+          <w:lang w:eastAsia="en-GB"/>
+        </w:rPr>
+      </w:pPr>
+      <w:r>
+        <w:rPr>
+          <w:lang w:eastAsia="en-GB"/>
+        </w:rPr>
+        <w:t>Configured the Pi server to run persistently for demonstrations.</w:t>
+      </w:r>
+    </w:p>
+    <w:p>
+      <w:pPr>
+        <w:pStyle w:val="Heading1"/>
+        <w:jc w:val="center"/>
+        <w:rPr>
+          <w:lang w:eastAsia="en-GB"/>
+        </w:rPr>
+      </w:pPr>
+      <w:r>
+        <w:rPr>
+          <w:lang w:eastAsia="en-GB"/>
         </w:rPr>
         <w:br w:type="page"/>
       </w:r>
+      <w:r>
+        <w:rPr>
+          <w:lang w:eastAsia="en-GB"/>
+        </w:rPr>
+        <w:lastRenderedPageBreak/>
+        <w:t xml:space="preserve">Week 5: </w:t>
+      </w:r>
+    </w:p>
+    <w:p>
+      <w:pPr>
+        <w:rPr>
+          <w:lang w:eastAsia="en-GB"/>
+        </w:rPr>
+      </w:pPr>
     </w:p>
     <w:tbl>
       <w:tblPr>
@@ -1360,7 +1754,6 @@
           <w:p>
             <w:pPr>
               <w:spacing w:before="100" w:beforeAutospacing="1" w:after="100" w:afterAutospacing="1"/>
-              <w:jc w:val="center"/>
               <w:rPr>
                 <w:rFonts w:eastAsia="Times New Roman" w:cs="Times New Roman"/>
                 <w:b/>
@@ -1383,7 +1776,6 @@
                 <w:lang w:eastAsia="en-GB"/>
                 <w14:ligatures w14:val="none"/>
               </w:rPr>
-              <w:lastRenderedPageBreak/>
               <w:t>Week</w:t>
             </w:r>
           </w:p>
@@ -1785,31 +2177,7 @@
                 <w:lang w:eastAsia="en-GB"/>
                 <w14:ligatures w14:val="none"/>
               </w:rPr>
-              <w:t xml:space="preserve">Reviewed both notebooks and documented corrections; exported model to ExecuTorch and verified against PyTorch; deployed on Pi (~3 </w:t>
-            </w:r>
-            <w:proofErr w:type="spellStart"/>
-            <w:r>
-              <w:rPr>
-                <w:rFonts w:eastAsia="Times New Roman" w:cs="Times New Roman"/>
-                <w:kern w:val="0"/>
-                <w:sz w:val="24"/>
-                <w:szCs w:val="24"/>
-                <w:lang w:eastAsia="en-GB"/>
-                <w14:ligatures w14:val="none"/>
-              </w:rPr>
-              <w:t>ms</w:t>
-            </w:r>
-            <w:proofErr w:type="spellEnd"/>
-            <w:r>
-              <w:rPr>
-                <w:rFonts w:eastAsia="Times New Roman" w:cs="Times New Roman"/>
-                <w:kern w:val="0"/>
-                <w:sz w:val="24"/>
-                <w:szCs w:val="24"/>
-                <w:lang w:eastAsia="en-GB"/>
-                <w14:ligatures w14:val="none"/>
-              </w:rPr>
-              <w:t xml:space="preserve"> inference); built classifier and lookup-table advice modules and integrated into Pi server; </w:t>
+              <w:t xml:space="preserve">Reviewed both notebooks and documented corrections; exported model to ExecuTorch and verified against PyTorch; deployed on Pi (~3 ms inference); built </w:t>
             </w:r>
             <w:r>
               <w:rPr>
@@ -1821,7 +2189,7 @@
                 <w14:ligatures w14:val="none"/>
               </w:rPr>
               <w:lastRenderedPageBreak/>
-              <w:t>connected app to show real predictions; reviewed Sanjeev’s app; identified real-world domain gap</w:t>
+              <w:t>classifier and lookup-table advice modules and integrated into Pi server; connected app to show real predictions; reviewed Sanjeev’s app; identified real-world domain gap</w:t>
             </w:r>
           </w:p>
         </w:tc>
@@ -1907,6 +2275,149 @@
           </w:p>
         </w:tc>
       </w:tr>
+      <w:tr>
+        <w:tc>
+          <w:tcPr>
+            <w:tcW w:w="2254" w:type="dxa"/>
+          </w:tcPr>
+          <w:p>
+            <w:pPr>
+              <w:spacing w:before="100" w:beforeAutospacing="1" w:after="100" w:afterAutospacing="1"/>
+              <w:jc w:val="center"/>
+              <w:rPr>
+                <w:rFonts w:eastAsia="Times New Roman" w:cs="Times New Roman"/>
+                <w:kern w:val="0"/>
+                <w:sz w:val="24"/>
+                <w:szCs w:val="24"/>
+                <w:lang w:eastAsia="en-GB"/>
+                <w14:ligatures w14:val="none"/>
+              </w:rPr>
+            </w:pPr>
+            <w:r>
+              <w:rPr>
+                <w:rFonts w:eastAsia="Times New Roman" w:cs="Times New Roman"/>
+                <w:kern w:val="0"/>
+                <w:sz w:val="24"/>
+                <w:szCs w:val="24"/>
+                <w:lang w:eastAsia="en-GB"/>
+                <w14:ligatures w14:val="none"/>
+              </w:rPr>
+              <w:t>4</w:t>
+            </w:r>
+          </w:p>
+        </w:tc>
+        <w:tc>
+          <w:tcPr>
+            <w:tcW w:w="2254" w:type="dxa"/>
+          </w:tcPr>
+          <w:p>
+            <w:pPr>
+              <w:spacing w:before="100" w:beforeAutospacing="1" w:after="100" w:afterAutospacing="1"/>
+              <w:rPr>
+                <w:rFonts w:eastAsia="Times New Roman" w:cs="Times New Roman"/>
+                <w:kern w:val="0"/>
+                <w:sz w:val="24"/>
+                <w:szCs w:val="24"/>
+                <w:lang w:eastAsia="en-GB"/>
+                <w14:ligatures w14:val="none"/>
+              </w:rPr>
+            </w:pPr>
+            <w:r>
+              <w:rPr>
+                <w:rFonts w:eastAsia="Times New Roman" w:cs="Times New Roman"/>
+                <w:kern w:val="0"/>
+                <w:sz w:val="24"/>
+                <w:szCs w:val="24"/>
+                <w:lang w:eastAsia="en-GB"/>
+                <w14:ligatures w14:val="none"/>
+              </w:rPr>
+              <w:t xml:space="preserve">Data Analysis 2.0: merged </w:t>
+            </w:r>
+            <w:proofErr w:type="spellStart"/>
+            <w:r>
+              <w:rPr>
+                <w:rFonts w:eastAsia="Times New Roman" w:cs="Times New Roman"/>
+                <w:kern w:val="0"/>
+                <w:sz w:val="24"/>
+                <w:szCs w:val="24"/>
+                <w:lang w:eastAsia="en-GB"/>
+                <w14:ligatures w14:val="none"/>
+              </w:rPr>
+              <w:t>RealWaste</w:t>
+            </w:r>
+            <w:proofErr w:type="spellEnd"/>
+            <w:r>
+              <w:rPr>
+                <w:rFonts w:eastAsia="Times New Roman" w:cs="Times New Roman"/>
+                <w:kern w:val="0"/>
+                <w:sz w:val="24"/>
+                <w:szCs w:val="24"/>
+                <w:lang w:eastAsia="en-GB"/>
+                <w14:ligatures w14:val="none"/>
+              </w:rPr>
+              <w:t xml:space="preserve"> with two additional datasets, audited duplicates, restructured into 8 UK disposal classes (14,424 images, imbalance reduced to 2.24x), MobileNetV3-Small benchmark at 90.9%; EfficientNet benchmark (B0, B1, B2, Lite0), selected EfficientNet-B0 (94.3%, 16 MB); exported EfficientNet-B0 to ExecuTorch for the Pi; began Pi memory measurement; documented system architecture and API contract; configured persistent demo server</w:t>
+            </w:r>
+          </w:p>
+        </w:tc>
+        <w:tc>
+          <w:tcPr>
+            <w:tcW w:w="2254" w:type="dxa"/>
+          </w:tcPr>
+          <w:p>
+            <w:pPr>
+              <w:spacing w:before="100" w:beforeAutospacing="1" w:after="100" w:afterAutospacing="1"/>
+              <w:rPr>
+                <w:rFonts w:eastAsia="Times New Roman" w:cs="Times New Roman"/>
+                <w:kern w:val="0"/>
+                <w:sz w:val="24"/>
+                <w:szCs w:val="24"/>
+                <w:lang w:eastAsia="en-GB"/>
+                <w14:ligatures w14:val="none"/>
+              </w:rPr>
+            </w:pPr>
+            <w:r>
+              <w:rPr>
+                <w:rFonts w:eastAsia="Times New Roman" w:cs="Times New Roman"/>
+                <w:kern w:val="0"/>
+                <w:sz w:val="24"/>
+                <w:szCs w:val="24"/>
+                <w:lang w:eastAsia="en-GB"/>
+                <w14:ligatures w14:val="none"/>
+              </w:rPr>
+              <w:t>ResNet benchmark (ResNet-18, 34, 50), finding no accuracy gain despite larger size and slower speed</w:t>
+            </w:r>
+          </w:p>
+        </w:tc>
+        <w:tc>
+          <w:tcPr>
+            <w:tcW w:w="2254" w:type="dxa"/>
+          </w:tcPr>
+          <w:p>
+            <w:pPr>
+              <w:spacing w:before="100" w:beforeAutospacing="1" w:after="100" w:afterAutospacing="1"/>
+              <w:rPr>
+                <w:rFonts w:eastAsia="Times New Roman" w:cs="Times New Roman"/>
+                <w:kern w:val="0"/>
+                <w:sz w:val="24"/>
+                <w:szCs w:val="24"/>
+                <w:lang w:eastAsia="en-GB"/>
+                <w14:ligatures w14:val="none"/>
+              </w:rPr>
+            </w:pPr>
+            <w:r>
+              <w:rPr>
+                <w:rFonts w:eastAsia="Times New Roman" w:cs="Times New Roman"/>
+                <w:kern w:val="0"/>
+                <w:sz w:val="24"/>
+                <w:szCs w:val="24"/>
+                <w:lang w:eastAsia="en-GB"/>
+                <w14:ligatures w14:val="none"/>
+              </w:rPr>
+              <w:t>MobileNet benchmark (V3-Small, V3-Large, V2), identifying MobileNetV3-Large as strongest at 93.0%</w:t>
+            </w:r>
+          </w:p>
+        </w:tc>
+      </w:tr>
     </w:tbl>
     <w:p>
       <w:pPr>
@@ -2345,6 +2856,155 @@
     </w:lvl>
   </w:abstractNum>
   <w:abstractNum w:abstractNumId="3" w15:restartNumberingAfterBreak="0">
+    <w:nsid w:val="05996F71"/>
+    <w:multiLevelType w:val="multilevel"/>
+    <w:tmpl w:val="049E9AC4"/>
+    <w:lvl w:ilvl="0">
+      <w:start w:val="1"/>
+      <w:numFmt w:val="bullet"/>
+      <w:lvlText w:val=""/>
+      <w:lvlJc w:val="left"/>
+      <w:pPr>
+        <w:tabs>
+          <w:tab w:val="num" w:pos="720"/>
+        </w:tabs>
+        <w:ind w:left="720" w:hanging="360"/>
+      </w:pPr>
+      <w:rPr>
+        <w:rFonts w:ascii="Symbol" w:hAnsi="Symbol" w:hint="default"/>
+        <w:sz w:val="20"/>
+      </w:rPr>
+    </w:lvl>
+    <w:lvl w:ilvl="1" w:tentative="1">
+      <w:start w:val="1"/>
+      <w:numFmt w:val="bullet"/>
+      <w:lvlText w:val="o"/>
+      <w:lvlJc w:val="left"/>
+      <w:pPr>
+        <w:tabs>
+          <w:tab w:val="num" w:pos="1440"/>
+        </w:tabs>
+        <w:ind w:left="1440" w:hanging="360"/>
+      </w:pPr>
+      <w:rPr>
+        <w:rFonts w:ascii="Courier New" w:hAnsi="Courier New" w:hint="default"/>
+        <w:sz w:val="20"/>
+      </w:rPr>
+    </w:lvl>
+    <w:lvl w:ilvl="2" w:tentative="1">
+      <w:start w:val="1"/>
+      <w:numFmt w:val="bullet"/>
+      <w:lvlText w:val=""/>
+      <w:lvlJc w:val="left"/>
+      <w:pPr>
+        <w:tabs>
+          <w:tab w:val="num" w:pos="2160"/>
+        </w:tabs>
+        <w:ind w:left="2160" w:hanging="360"/>
+      </w:pPr>
+      <w:rPr>
+        <w:rFonts w:ascii="Wingdings" w:hAnsi="Wingdings" w:hint="default"/>
+        <w:sz w:val="20"/>
+      </w:rPr>
+    </w:lvl>
+    <w:lvl w:ilvl="3" w:tentative="1">
+      <w:start w:val="1"/>
+      <w:numFmt w:val="bullet"/>
+      <w:lvlText w:val=""/>
+      <w:lvlJc w:val="left"/>
+      <w:pPr>
+        <w:tabs>
+          <w:tab w:val="num" w:pos="2880"/>
+        </w:tabs>
+        <w:ind w:left="2880" w:hanging="360"/>
+      </w:pPr>
+      <w:rPr>
+        <w:rFonts w:ascii="Wingdings" w:hAnsi="Wingdings" w:hint="default"/>
+        <w:sz w:val="20"/>
+      </w:rPr>
+    </w:lvl>
+    <w:lvl w:ilvl="4" w:tentative="1">
+      <w:start w:val="1"/>
+      <w:numFmt w:val="bullet"/>
+      <w:lvlText w:val=""/>
+      <w:lvlJc w:val="left"/>
+      <w:pPr>
+        <w:tabs>
+          <w:tab w:val="num" w:pos="3600"/>
+        </w:tabs>
+        <w:ind w:left="3600" w:hanging="360"/>
+      </w:pPr>
+      <w:rPr>
+        <w:rFonts w:ascii="Wingdings" w:hAnsi="Wingdings" w:hint="default"/>
+        <w:sz w:val="20"/>
+      </w:rPr>
+    </w:lvl>
+    <w:lvl w:ilvl="5" w:tentative="1">
+      <w:start w:val="1"/>
+      <w:numFmt w:val="bullet"/>
+      <w:lvlText w:val=""/>
+      <w:lvlJc w:val="left"/>
+      <w:pPr>
+        <w:tabs>
+          <w:tab w:val="num" w:pos="4320"/>
+        </w:tabs>
+        <w:ind w:left="4320" w:hanging="360"/>
+      </w:pPr>
+      <w:rPr>
+        <w:rFonts w:ascii="Wingdings" w:hAnsi="Wingdings" w:hint="default"/>
+        <w:sz w:val="20"/>
+      </w:rPr>
+    </w:lvl>
+    <w:lvl w:ilvl="6" w:tentative="1">
+      <w:start w:val="1"/>
+      <w:numFmt w:val="bullet"/>
+      <w:lvlText w:val=""/>
+      <w:lvlJc w:val="left"/>
+      <w:pPr>
+        <w:tabs>
+          <w:tab w:val="num" w:pos="5040"/>
+        </w:tabs>
+        <w:ind w:left="5040" w:hanging="360"/>
+      </w:pPr>
+      <w:rPr>
+        <w:rFonts w:ascii="Wingdings" w:hAnsi="Wingdings" w:hint="default"/>
+        <w:sz w:val="20"/>
+      </w:rPr>
+    </w:lvl>
+    <w:lvl w:ilvl="7" w:tentative="1">
+      <w:start w:val="1"/>
+      <w:numFmt w:val="bullet"/>
+      <w:lvlText w:val=""/>
+      <w:lvlJc w:val="left"/>
+      <w:pPr>
+        <w:tabs>
+          <w:tab w:val="num" w:pos="5760"/>
+        </w:tabs>
+        <w:ind w:left="5760" w:hanging="360"/>
+      </w:pPr>
+      <w:rPr>
+        <w:rFonts w:ascii="Wingdings" w:hAnsi="Wingdings" w:hint="default"/>
+        <w:sz w:val="20"/>
+      </w:rPr>
+    </w:lvl>
+    <w:lvl w:ilvl="8" w:tentative="1">
+      <w:start w:val="1"/>
+      <w:numFmt w:val="bullet"/>
+      <w:lvlText w:val=""/>
+      <w:lvlJc w:val="left"/>
+      <w:pPr>
+        <w:tabs>
+          <w:tab w:val="num" w:pos="6480"/>
+        </w:tabs>
+        <w:ind w:left="6480" w:hanging="360"/>
+      </w:pPr>
+      <w:rPr>
+        <w:rFonts w:ascii="Wingdings" w:hAnsi="Wingdings" w:hint="default"/>
+        <w:sz w:val="20"/>
+      </w:rPr>
+    </w:lvl>
+  </w:abstractNum>
+  <w:abstractNum w:abstractNumId="4" w15:restartNumberingAfterBreak="0">
     <w:nsid w:val="06A91F4E"/>
     <w:multiLevelType w:val="hybridMultilevel"/>
     <w:tmpl w:val="74BCCFB2"/>
@@ -2457,7 +3117,156 @@
       </w:rPr>
     </w:lvl>
   </w:abstractNum>
-  <w:abstractNum w:abstractNumId="4" w15:restartNumberingAfterBreak="0">
+  <w:abstractNum w:abstractNumId="5" w15:restartNumberingAfterBreak="0">
+    <w:nsid w:val="0B171EB6"/>
+    <w:multiLevelType w:val="multilevel"/>
+    <w:tmpl w:val="CE50887A"/>
+    <w:lvl w:ilvl="0">
+      <w:start w:val="1"/>
+      <w:numFmt w:val="bullet"/>
+      <w:lvlText w:val=""/>
+      <w:lvlJc w:val="left"/>
+      <w:pPr>
+        <w:tabs>
+          <w:tab w:val="num" w:pos="720"/>
+        </w:tabs>
+        <w:ind w:left="720" w:hanging="360"/>
+      </w:pPr>
+      <w:rPr>
+        <w:rFonts w:ascii="Symbol" w:hAnsi="Symbol" w:hint="default"/>
+        <w:sz w:val="20"/>
+      </w:rPr>
+    </w:lvl>
+    <w:lvl w:ilvl="1" w:tentative="1">
+      <w:start w:val="1"/>
+      <w:numFmt w:val="bullet"/>
+      <w:lvlText w:val="o"/>
+      <w:lvlJc w:val="left"/>
+      <w:pPr>
+        <w:tabs>
+          <w:tab w:val="num" w:pos="1440"/>
+        </w:tabs>
+        <w:ind w:left="1440" w:hanging="360"/>
+      </w:pPr>
+      <w:rPr>
+        <w:rFonts w:ascii="Courier New" w:hAnsi="Courier New" w:hint="default"/>
+        <w:sz w:val="20"/>
+      </w:rPr>
+    </w:lvl>
+    <w:lvl w:ilvl="2" w:tentative="1">
+      <w:start w:val="1"/>
+      <w:numFmt w:val="bullet"/>
+      <w:lvlText w:val=""/>
+      <w:lvlJc w:val="left"/>
+      <w:pPr>
+        <w:tabs>
+          <w:tab w:val="num" w:pos="2160"/>
+        </w:tabs>
+        <w:ind w:left="2160" w:hanging="360"/>
+      </w:pPr>
+      <w:rPr>
+        <w:rFonts w:ascii="Wingdings" w:hAnsi="Wingdings" w:hint="default"/>
+        <w:sz w:val="20"/>
+      </w:rPr>
+    </w:lvl>
+    <w:lvl w:ilvl="3" w:tentative="1">
+      <w:start w:val="1"/>
+      <w:numFmt w:val="bullet"/>
+      <w:lvlText w:val=""/>
+      <w:lvlJc w:val="left"/>
+      <w:pPr>
+        <w:tabs>
+          <w:tab w:val="num" w:pos="2880"/>
+        </w:tabs>
+        <w:ind w:left="2880" w:hanging="360"/>
+      </w:pPr>
+      <w:rPr>
+        <w:rFonts w:ascii="Wingdings" w:hAnsi="Wingdings" w:hint="default"/>
+        <w:sz w:val="20"/>
+      </w:rPr>
+    </w:lvl>
+    <w:lvl w:ilvl="4" w:tentative="1">
+      <w:start w:val="1"/>
+      <w:numFmt w:val="bullet"/>
+      <w:lvlText w:val=""/>
+      <w:lvlJc w:val="left"/>
+      <w:pPr>
+        <w:tabs>
+          <w:tab w:val="num" w:pos="3600"/>
+        </w:tabs>
+        <w:ind w:left="3600" w:hanging="360"/>
+      </w:pPr>
+      <w:rPr>
+        <w:rFonts w:ascii="Wingdings" w:hAnsi="Wingdings" w:hint="default"/>
+        <w:sz w:val="20"/>
+      </w:rPr>
+    </w:lvl>
+    <w:lvl w:ilvl="5" w:tentative="1">
+      <w:start w:val="1"/>
+      <w:numFmt w:val="bullet"/>
+      <w:lvlText w:val=""/>
+      <w:lvlJc w:val="left"/>
+      <w:pPr>
+        <w:tabs>
+          <w:tab w:val="num" w:pos="4320"/>
+        </w:tabs>
+        <w:ind w:left="4320" w:hanging="360"/>
+      </w:pPr>
+      <w:rPr>
+        <w:rFonts w:ascii="Wingdings" w:hAnsi="Wingdings" w:hint="default"/>
+        <w:sz w:val="20"/>
+      </w:rPr>
+    </w:lvl>
+    <w:lvl w:ilvl="6" w:tentative="1">
+      <w:start w:val="1"/>
+      <w:numFmt w:val="bullet"/>
+      <w:lvlText w:val=""/>
+      <w:lvlJc w:val="left"/>
+      <w:pPr>
+        <w:tabs>
+          <w:tab w:val="num" w:pos="5040"/>
+        </w:tabs>
+        <w:ind w:left="5040" w:hanging="360"/>
+      </w:pPr>
+      <w:rPr>
+        <w:rFonts w:ascii="Wingdings" w:hAnsi="Wingdings" w:hint="default"/>
+        <w:sz w:val="20"/>
+      </w:rPr>
+    </w:lvl>
+    <w:lvl w:ilvl="7" w:tentative="1">
+      <w:start w:val="1"/>
+      <w:numFmt w:val="bullet"/>
+      <w:lvlText w:val=""/>
+      <w:lvlJc w:val="left"/>
+      <w:pPr>
+        <w:tabs>
+          <w:tab w:val="num" w:pos="5760"/>
+        </w:tabs>
+        <w:ind w:left="5760" w:hanging="360"/>
+      </w:pPr>
+      <w:rPr>
+        <w:rFonts w:ascii="Wingdings" w:hAnsi="Wingdings" w:hint="default"/>
+        <w:sz w:val="20"/>
+      </w:rPr>
+    </w:lvl>
+    <w:lvl w:ilvl="8" w:tentative="1">
+      <w:start w:val="1"/>
+      <w:numFmt w:val="bullet"/>
+      <w:lvlText w:val=""/>
+      <w:lvlJc w:val="left"/>
+      <w:pPr>
+        <w:tabs>
+          <w:tab w:val="num" w:pos="6480"/>
+        </w:tabs>
+        <w:ind w:left="6480" w:hanging="360"/>
+      </w:pPr>
+      <w:rPr>
+        <w:rFonts w:ascii="Wingdings" w:hAnsi="Wingdings" w:hint="default"/>
+        <w:sz w:val="20"/>
+      </w:rPr>
+    </w:lvl>
+  </w:abstractNum>
+  <w:abstractNum w:abstractNumId="6" w15:restartNumberingAfterBreak="0">
     <w:nsid w:val="0EC95B20"/>
     <w:multiLevelType w:val="hybridMultilevel"/>
     <w:tmpl w:val="48A08DC2"/>
@@ -2570,7 +3379,7 @@
       </w:rPr>
     </w:lvl>
   </w:abstractNum>
-  <w:abstractNum w:abstractNumId="5" w15:restartNumberingAfterBreak="0">
+  <w:abstractNum w:abstractNumId="7" w15:restartNumberingAfterBreak="0">
     <w:nsid w:val="110521ED"/>
     <w:multiLevelType w:val="multilevel"/>
     <w:tmpl w:val="5422090E"/>
@@ -2719,7 +3528,7 @@
       </w:rPr>
     </w:lvl>
   </w:abstractNum>
-  <w:abstractNum w:abstractNumId="6" w15:restartNumberingAfterBreak="0">
+  <w:abstractNum w:abstractNumId="8" w15:restartNumberingAfterBreak="0">
     <w:nsid w:val="127B199A"/>
     <w:multiLevelType w:val="multilevel"/>
     <w:tmpl w:val="AE22FC1C"/>
@@ -2868,7 +3677,7 @@
       </w:rPr>
     </w:lvl>
   </w:abstractNum>
-  <w:abstractNum w:abstractNumId="7" w15:restartNumberingAfterBreak="0">
+  <w:abstractNum w:abstractNumId="9" w15:restartNumberingAfterBreak="0">
     <w:nsid w:val="144D7A7E"/>
     <w:multiLevelType w:val="multilevel"/>
     <w:tmpl w:val="2E2CCDC6"/>
@@ -3017,7 +3826,156 @@
       </w:rPr>
     </w:lvl>
   </w:abstractNum>
-  <w:abstractNum w:abstractNumId="8" w15:restartNumberingAfterBreak="0">
+  <w:abstractNum w:abstractNumId="10" w15:restartNumberingAfterBreak="0">
+    <w:nsid w:val="16A4338E"/>
+    <w:multiLevelType w:val="multilevel"/>
+    <w:tmpl w:val="22C07CFE"/>
+    <w:lvl w:ilvl="0">
+      <w:start w:val="1"/>
+      <w:numFmt w:val="bullet"/>
+      <w:lvlText w:val=""/>
+      <w:lvlJc w:val="left"/>
+      <w:pPr>
+        <w:tabs>
+          <w:tab w:val="num" w:pos="720"/>
+        </w:tabs>
+        <w:ind w:left="720" w:hanging="360"/>
+      </w:pPr>
+      <w:rPr>
+        <w:rFonts w:ascii="Symbol" w:hAnsi="Symbol" w:hint="default"/>
+        <w:sz w:val="20"/>
+      </w:rPr>
+    </w:lvl>
+    <w:lvl w:ilvl="1" w:tentative="1">
+      <w:start w:val="1"/>
+      <w:numFmt w:val="bullet"/>
+      <w:lvlText w:val="o"/>
+      <w:lvlJc w:val="left"/>
+      <w:pPr>
+        <w:tabs>
+          <w:tab w:val="num" w:pos="1440"/>
+        </w:tabs>
+        <w:ind w:left="1440" w:hanging="360"/>
+      </w:pPr>
+      <w:rPr>
+        <w:rFonts w:ascii="Courier New" w:hAnsi="Courier New" w:hint="default"/>
+        <w:sz w:val="20"/>
+      </w:rPr>
+    </w:lvl>
+    <w:lvl w:ilvl="2" w:tentative="1">
+      <w:start w:val="1"/>
+      <w:numFmt w:val="bullet"/>
+      <w:lvlText w:val=""/>
+      <w:lvlJc w:val="left"/>
+      <w:pPr>
+        <w:tabs>
+          <w:tab w:val="num" w:pos="2160"/>
+        </w:tabs>
+        <w:ind w:left="2160" w:hanging="360"/>
+      </w:pPr>
+      <w:rPr>
+        <w:rFonts w:ascii="Wingdings" w:hAnsi="Wingdings" w:hint="default"/>
+        <w:sz w:val="20"/>
+      </w:rPr>
+    </w:lvl>
+    <w:lvl w:ilvl="3" w:tentative="1">
+      <w:start w:val="1"/>
+      <w:numFmt w:val="bullet"/>
+      <w:lvlText w:val=""/>
+      <w:lvlJc w:val="left"/>
+      <w:pPr>
+        <w:tabs>
+          <w:tab w:val="num" w:pos="2880"/>
+        </w:tabs>
+        <w:ind w:left="2880" w:hanging="360"/>
+      </w:pPr>
+      <w:rPr>
+        <w:rFonts w:ascii="Wingdings" w:hAnsi="Wingdings" w:hint="default"/>
+        <w:sz w:val="20"/>
+      </w:rPr>
+    </w:lvl>
+    <w:lvl w:ilvl="4" w:tentative="1">
+      <w:start w:val="1"/>
+      <w:numFmt w:val="bullet"/>
+      <w:lvlText w:val=""/>
+      <w:lvlJc w:val="left"/>
+      <w:pPr>
+        <w:tabs>
+          <w:tab w:val="num" w:pos="3600"/>
+        </w:tabs>
+        <w:ind w:left="3600" w:hanging="360"/>
+      </w:pPr>
+      <w:rPr>
+        <w:rFonts w:ascii="Wingdings" w:hAnsi="Wingdings" w:hint="default"/>
+        <w:sz w:val="20"/>
+      </w:rPr>
+    </w:lvl>
+    <w:lvl w:ilvl="5" w:tentative="1">
+      <w:start w:val="1"/>
+      <w:numFmt w:val="bullet"/>
+      <w:lvlText w:val=""/>
+      <w:lvlJc w:val="left"/>
+      <w:pPr>
+        <w:tabs>
+          <w:tab w:val="num" w:pos="4320"/>
+        </w:tabs>
+        <w:ind w:left="4320" w:hanging="360"/>
+      </w:pPr>
+      <w:rPr>
+        <w:rFonts w:ascii="Wingdings" w:hAnsi="Wingdings" w:hint="default"/>
+        <w:sz w:val="20"/>
+      </w:rPr>
+    </w:lvl>
+    <w:lvl w:ilvl="6" w:tentative="1">
+      <w:start w:val="1"/>
+      <w:numFmt w:val="bullet"/>
+      <w:lvlText w:val=""/>
+      <w:lvlJc w:val="left"/>
+      <w:pPr>
+        <w:tabs>
+          <w:tab w:val="num" w:pos="5040"/>
+        </w:tabs>
+        <w:ind w:left="5040" w:hanging="360"/>
+      </w:pPr>
+      <w:rPr>
+        <w:rFonts w:ascii="Wingdings" w:hAnsi="Wingdings" w:hint="default"/>
+        <w:sz w:val="20"/>
+      </w:rPr>
+    </w:lvl>
+    <w:lvl w:ilvl="7" w:tentative="1">
+      <w:start w:val="1"/>
+      <w:numFmt w:val="bullet"/>
+      <w:lvlText w:val=""/>
+      <w:lvlJc w:val="left"/>
+      <w:pPr>
+        <w:tabs>
+          <w:tab w:val="num" w:pos="5760"/>
+        </w:tabs>
+        <w:ind w:left="5760" w:hanging="360"/>
+      </w:pPr>
+      <w:rPr>
+        <w:rFonts w:ascii="Wingdings" w:hAnsi="Wingdings" w:hint="default"/>
+        <w:sz w:val="20"/>
+      </w:rPr>
+    </w:lvl>
+    <w:lvl w:ilvl="8" w:tentative="1">
+      <w:start w:val="1"/>
+      <w:numFmt w:val="bullet"/>
+      <w:lvlText w:val=""/>
+      <w:lvlJc w:val="left"/>
+      <w:pPr>
+        <w:tabs>
+          <w:tab w:val="num" w:pos="6480"/>
+        </w:tabs>
+        <w:ind w:left="6480" w:hanging="360"/>
+      </w:pPr>
+      <w:rPr>
+        <w:rFonts w:ascii="Wingdings" w:hAnsi="Wingdings" w:hint="default"/>
+        <w:sz w:val="20"/>
+      </w:rPr>
+    </w:lvl>
+  </w:abstractNum>
+  <w:abstractNum w:abstractNumId="11" w15:restartNumberingAfterBreak="0">
     <w:nsid w:val="17A1322F"/>
     <w:multiLevelType w:val="hybridMultilevel"/>
     <w:tmpl w:val="FF808270"/>
@@ -3103,10 +4061,10 @@
       </w:pPr>
     </w:lvl>
   </w:abstractNum>
-  <w:abstractNum w:abstractNumId="9" w15:restartNumberingAfterBreak="0">
+  <w:abstractNum w:abstractNumId="12" w15:restartNumberingAfterBreak="0">
     <w:nsid w:val="19E3502F"/>
     <w:multiLevelType w:val="hybridMultilevel"/>
-    <w:tmpl w:val="BF6899B2"/>
+    <w:tmpl w:val="022254DC"/>
     <w:lvl w:ilvl="0" w:tplc="08090001">
       <w:start w:val="1"/>
       <w:numFmt w:val="bullet"/>
@@ -3216,7 +4174,7 @@
       </w:rPr>
     </w:lvl>
   </w:abstractNum>
-  <w:abstractNum w:abstractNumId="10" w15:restartNumberingAfterBreak="0">
+  <w:abstractNum w:abstractNumId="13" w15:restartNumberingAfterBreak="0">
     <w:nsid w:val="1FE13357"/>
     <w:multiLevelType w:val="multilevel"/>
     <w:tmpl w:val="94D667D8"/>
@@ -3365,7 +4323,156 @@
       </w:rPr>
     </w:lvl>
   </w:abstractNum>
-  <w:abstractNum w:abstractNumId="11" w15:restartNumberingAfterBreak="0">
+  <w:abstractNum w:abstractNumId="14" w15:restartNumberingAfterBreak="0">
+    <w:nsid w:val="25E73878"/>
+    <w:multiLevelType w:val="multilevel"/>
+    <w:tmpl w:val="46407D1A"/>
+    <w:lvl w:ilvl="0">
+      <w:start w:val="1"/>
+      <w:numFmt w:val="bullet"/>
+      <w:lvlText w:val=""/>
+      <w:lvlJc w:val="left"/>
+      <w:pPr>
+        <w:tabs>
+          <w:tab w:val="num" w:pos="720"/>
+        </w:tabs>
+        <w:ind w:left="720" w:hanging="360"/>
+      </w:pPr>
+      <w:rPr>
+        <w:rFonts w:ascii="Symbol" w:hAnsi="Symbol" w:hint="default"/>
+        <w:sz w:val="20"/>
+      </w:rPr>
+    </w:lvl>
+    <w:lvl w:ilvl="1" w:tentative="1">
+      <w:start w:val="1"/>
+      <w:numFmt w:val="bullet"/>
+      <w:lvlText w:val="o"/>
+      <w:lvlJc w:val="left"/>
+      <w:pPr>
+        <w:tabs>
+          <w:tab w:val="num" w:pos="1440"/>
+        </w:tabs>
+        <w:ind w:left="1440" w:hanging="360"/>
+      </w:pPr>
+      <w:rPr>
+        <w:rFonts w:ascii="Courier New" w:hAnsi="Courier New" w:hint="default"/>
+        <w:sz w:val="20"/>
+      </w:rPr>
+    </w:lvl>
+    <w:lvl w:ilvl="2" w:tentative="1">
+      <w:start w:val="1"/>
+      <w:numFmt w:val="bullet"/>
+      <w:lvlText w:val=""/>
+      <w:lvlJc w:val="left"/>
+      <w:pPr>
+        <w:tabs>
+          <w:tab w:val="num" w:pos="2160"/>
+        </w:tabs>
+        <w:ind w:left="2160" w:hanging="360"/>
+      </w:pPr>
+      <w:rPr>
+        <w:rFonts w:ascii="Wingdings" w:hAnsi="Wingdings" w:hint="default"/>
+        <w:sz w:val="20"/>
+      </w:rPr>
+    </w:lvl>
+    <w:lvl w:ilvl="3" w:tentative="1">
+      <w:start w:val="1"/>
+      <w:numFmt w:val="bullet"/>
+      <w:lvlText w:val=""/>
+      <w:lvlJc w:val="left"/>
+      <w:pPr>
+        <w:tabs>
+          <w:tab w:val="num" w:pos="2880"/>
+        </w:tabs>
+        <w:ind w:left="2880" w:hanging="360"/>
+      </w:pPr>
+      <w:rPr>
+        <w:rFonts w:ascii="Wingdings" w:hAnsi="Wingdings" w:hint="default"/>
+        <w:sz w:val="20"/>
+      </w:rPr>
+    </w:lvl>
+    <w:lvl w:ilvl="4" w:tentative="1">
+      <w:start w:val="1"/>
+      <w:numFmt w:val="bullet"/>
+      <w:lvlText w:val=""/>
+      <w:lvlJc w:val="left"/>
+      <w:pPr>
+        <w:tabs>
+          <w:tab w:val="num" w:pos="3600"/>
+        </w:tabs>
+        <w:ind w:left="3600" w:hanging="360"/>
+      </w:pPr>
+      <w:rPr>
+        <w:rFonts w:ascii="Wingdings" w:hAnsi="Wingdings" w:hint="default"/>
+        <w:sz w:val="20"/>
+      </w:rPr>
+    </w:lvl>
+    <w:lvl w:ilvl="5" w:tentative="1">
+      <w:start w:val="1"/>
+      <w:numFmt w:val="bullet"/>
+      <w:lvlText w:val=""/>
+      <w:lvlJc w:val="left"/>
+      <w:pPr>
+        <w:tabs>
+          <w:tab w:val="num" w:pos="4320"/>
+        </w:tabs>
+        <w:ind w:left="4320" w:hanging="360"/>
+      </w:pPr>
+      <w:rPr>
+        <w:rFonts w:ascii="Wingdings" w:hAnsi="Wingdings" w:hint="default"/>
+        <w:sz w:val="20"/>
+      </w:rPr>
+    </w:lvl>
+    <w:lvl w:ilvl="6" w:tentative="1">
+      <w:start w:val="1"/>
+      <w:numFmt w:val="bullet"/>
+      <w:lvlText w:val=""/>
+      <w:lvlJc w:val="left"/>
+      <w:pPr>
+        <w:tabs>
+          <w:tab w:val="num" w:pos="5040"/>
+        </w:tabs>
+        <w:ind w:left="5040" w:hanging="360"/>
+      </w:pPr>
+      <w:rPr>
+        <w:rFonts w:ascii="Wingdings" w:hAnsi="Wingdings" w:hint="default"/>
+        <w:sz w:val="20"/>
+      </w:rPr>
+    </w:lvl>
+    <w:lvl w:ilvl="7" w:tentative="1">
+      <w:start w:val="1"/>
+      <w:numFmt w:val="bullet"/>
+      <w:lvlText w:val=""/>
+      <w:lvlJc w:val="left"/>
+      <w:pPr>
+        <w:tabs>
+          <w:tab w:val="num" w:pos="5760"/>
+        </w:tabs>
+        <w:ind w:left="5760" w:hanging="360"/>
+      </w:pPr>
+      <w:rPr>
+        <w:rFonts w:ascii="Wingdings" w:hAnsi="Wingdings" w:hint="default"/>
+        <w:sz w:val="20"/>
+      </w:rPr>
+    </w:lvl>
+    <w:lvl w:ilvl="8" w:tentative="1">
+      <w:start w:val="1"/>
+      <w:numFmt w:val="bullet"/>
+      <w:lvlText w:val=""/>
+      <w:lvlJc w:val="left"/>
+      <w:pPr>
+        <w:tabs>
+          <w:tab w:val="num" w:pos="6480"/>
+        </w:tabs>
+        <w:ind w:left="6480" w:hanging="360"/>
+      </w:pPr>
+      <w:rPr>
+        <w:rFonts w:ascii="Wingdings" w:hAnsi="Wingdings" w:hint="default"/>
+        <w:sz w:val="20"/>
+      </w:rPr>
+    </w:lvl>
+  </w:abstractNum>
+  <w:abstractNum w:abstractNumId="15" w15:restartNumberingAfterBreak="0">
     <w:nsid w:val="28A04851"/>
     <w:multiLevelType w:val="hybridMultilevel"/>
     <w:tmpl w:val="FBBACE3E"/>
@@ -3478,7 +4585,7 @@
       </w:rPr>
     </w:lvl>
   </w:abstractNum>
-  <w:abstractNum w:abstractNumId="12" w15:restartNumberingAfterBreak="0">
+  <w:abstractNum w:abstractNumId="16" w15:restartNumberingAfterBreak="0">
     <w:nsid w:val="28DE1534"/>
     <w:multiLevelType w:val="multilevel"/>
     <w:tmpl w:val="3C8082A8"/>
@@ -3627,7 +4734,7 @@
       </w:rPr>
     </w:lvl>
   </w:abstractNum>
-  <w:abstractNum w:abstractNumId="13" w15:restartNumberingAfterBreak="0">
+  <w:abstractNum w:abstractNumId="17" w15:restartNumberingAfterBreak="0">
     <w:nsid w:val="29166EF3"/>
     <w:multiLevelType w:val="multilevel"/>
     <w:tmpl w:val="4928F424"/>
@@ -3740,7 +4847,7 @@
       </w:pPr>
     </w:lvl>
   </w:abstractNum>
-  <w:abstractNum w:abstractNumId="14" w15:restartNumberingAfterBreak="0">
+  <w:abstractNum w:abstractNumId="18" w15:restartNumberingAfterBreak="0">
     <w:nsid w:val="29F026CB"/>
     <w:multiLevelType w:val="hybridMultilevel"/>
     <w:tmpl w:val="50203508"/>
@@ -3855,7 +4962,7 @@
       </w:rPr>
     </w:lvl>
   </w:abstractNum>
-  <w:abstractNum w:abstractNumId="15" w15:restartNumberingAfterBreak="0">
+  <w:abstractNum w:abstractNumId="19" w15:restartNumberingAfterBreak="0">
     <w:nsid w:val="2F756524"/>
     <w:multiLevelType w:val="multilevel"/>
     <w:tmpl w:val="A78C4BE2"/>
@@ -4004,7 +5111,156 @@
       </w:rPr>
     </w:lvl>
   </w:abstractNum>
-  <w:abstractNum w:abstractNumId="16" w15:restartNumberingAfterBreak="0">
+  <w:abstractNum w:abstractNumId="20" w15:restartNumberingAfterBreak="0">
+    <w:nsid w:val="2FBE408C"/>
+    <w:multiLevelType w:val="multilevel"/>
+    <w:tmpl w:val="D8560606"/>
+    <w:lvl w:ilvl="0">
+      <w:start w:val="1"/>
+      <w:numFmt w:val="bullet"/>
+      <w:lvlText w:val=""/>
+      <w:lvlJc w:val="left"/>
+      <w:pPr>
+        <w:tabs>
+          <w:tab w:val="num" w:pos="720"/>
+        </w:tabs>
+        <w:ind w:left="720" w:hanging="360"/>
+      </w:pPr>
+      <w:rPr>
+        <w:rFonts w:ascii="Symbol" w:hAnsi="Symbol" w:hint="default"/>
+        <w:sz w:val="20"/>
+      </w:rPr>
+    </w:lvl>
+    <w:lvl w:ilvl="1" w:tentative="1">
+      <w:start w:val="1"/>
+      <w:numFmt w:val="bullet"/>
+      <w:lvlText w:val="o"/>
+      <w:lvlJc w:val="left"/>
+      <w:pPr>
+        <w:tabs>
+          <w:tab w:val="num" w:pos="1440"/>
+        </w:tabs>
+        <w:ind w:left="1440" w:hanging="360"/>
+      </w:pPr>
+      <w:rPr>
+        <w:rFonts w:ascii="Courier New" w:hAnsi="Courier New" w:hint="default"/>
+        <w:sz w:val="20"/>
+      </w:rPr>
+    </w:lvl>
+    <w:lvl w:ilvl="2" w:tentative="1">
+      <w:start w:val="1"/>
+      <w:numFmt w:val="bullet"/>
+      <w:lvlText w:val=""/>
+      <w:lvlJc w:val="left"/>
+      <w:pPr>
+        <w:tabs>
+          <w:tab w:val="num" w:pos="2160"/>
+        </w:tabs>
+        <w:ind w:left="2160" w:hanging="360"/>
+      </w:pPr>
+      <w:rPr>
+        <w:rFonts w:ascii="Wingdings" w:hAnsi="Wingdings" w:hint="default"/>
+        <w:sz w:val="20"/>
+      </w:rPr>
+    </w:lvl>
+    <w:lvl w:ilvl="3" w:tentative="1">
+      <w:start w:val="1"/>
+      <w:numFmt w:val="bullet"/>
+      <w:lvlText w:val=""/>
+      <w:lvlJc w:val="left"/>
+      <w:pPr>
+        <w:tabs>
+          <w:tab w:val="num" w:pos="2880"/>
+        </w:tabs>
+        <w:ind w:left="2880" w:hanging="360"/>
+      </w:pPr>
+      <w:rPr>
+        <w:rFonts w:ascii="Wingdings" w:hAnsi="Wingdings" w:hint="default"/>
+        <w:sz w:val="20"/>
+      </w:rPr>
+    </w:lvl>
+    <w:lvl w:ilvl="4" w:tentative="1">
+      <w:start w:val="1"/>
+      <w:numFmt w:val="bullet"/>
+      <w:lvlText w:val=""/>
+      <w:lvlJc w:val="left"/>
+      <w:pPr>
+        <w:tabs>
+          <w:tab w:val="num" w:pos="3600"/>
+        </w:tabs>
+        <w:ind w:left="3600" w:hanging="360"/>
+      </w:pPr>
+      <w:rPr>
+        <w:rFonts w:ascii="Wingdings" w:hAnsi="Wingdings" w:hint="default"/>
+        <w:sz w:val="20"/>
+      </w:rPr>
+    </w:lvl>
+    <w:lvl w:ilvl="5" w:tentative="1">
+      <w:start w:val="1"/>
+      <w:numFmt w:val="bullet"/>
+      <w:lvlText w:val=""/>
+      <w:lvlJc w:val="left"/>
+      <w:pPr>
+        <w:tabs>
+          <w:tab w:val="num" w:pos="4320"/>
+        </w:tabs>
+        <w:ind w:left="4320" w:hanging="360"/>
+      </w:pPr>
+      <w:rPr>
+        <w:rFonts w:ascii="Wingdings" w:hAnsi="Wingdings" w:hint="default"/>
+        <w:sz w:val="20"/>
+      </w:rPr>
+    </w:lvl>
+    <w:lvl w:ilvl="6" w:tentative="1">
+      <w:start w:val="1"/>
+      <w:numFmt w:val="bullet"/>
+      <w:lvlText w:val=""/>
+      <w:lvlJc w:val="left"/>
+      <w:pPr>
+        <w:tabs>
+          <w:tab w:val="num" w:pos="5040"/>
+        </w:tabs>
+        <w:ind w:left="5040" w:hanging="360"/>
+      </w:pPr>
+      <w:rPr>
+        <w:rFonts w:ascii="Wingdings" w:hAnsi="Wingdings" w:hint="default"/>
+        <w:sz w:val="20"/>
+      </w:rPr>
+    </w:lvl>
+    <w:lvl w:ilvl="7" w:tentative="1">
+      <w:start w:val="1"/>
+      <w:numFmt w:val="bullet"/>
+      <w:lvlText w:val=""/>
+      <w:lvlJc w:val="left"/>
+      <w:pPr>
+        <w:tabs>
+          <w:tab w:val="num" w:pos="5760"/>
+        </w:tabs>
+        <w:ind w:left="5760" w:hanging="360"/>
+      </w:pPr>
+      <w:rPr>
+        <w:rFonts w:ascii="Wingdings" w:hAnsi="Wingdings" w:hint="default"/>
+        <w:sz w:val="20"/>
+      </w:rPr>
+    </w:lvl>
+    <w:lvl w:ilvl="8" w:tentative="1">
+      <w:start w:val="1"/>
+      <w:numFmt w:val="bullet"/>
+      <w:lvlText w:val=""/>
+      <w:lvlJc w:val="left"/>
+      <w:pPr>
+        <w:tabs>
+          <w:tab w:val="num" w:pos="6480"/>
+        </w:tabs>
+        <w:ind w:left="6480" w:hanging="360"/>
+      </w:pPr>
+      <w:rPr>
+        <w:rFonts w:ascii="Wingdings" w:hAnsi="Wingdings" w:hint="default"/>
+        <w:sz w:val="20"/>
+      </w:rPr>
+    </w:lvl>
+  </w:abstractNum>
+  <w:abstractNum w:abstractNumId="21" w15:restartNumberingAfterBreak="0">
     <w:nsid w:val="30D64DFD"/>
     <w:multiLevelType w:val="hybridMultilevel"/>
     <w:tmpl w:val="4D6EFF00"/>
@@ -4117,7 +5373,156 @@
       </w:rPr>
     </w:lvl>
   </w:abstractNum>
-  <w:abstractNum w:abstractNumId="17" w15:restartNumberingAfterBreak="0">
+  <w:abstractNum w:abstractNumId="22" w15:restartNumberingAfterBreak="0">
+    <w:nsid w:val="367C026E"/>
+    <w:multiLevelType w:val="multilevel"/>
+    <w:tmpl w:val="B9D6E006"/>
+    <w:lvl w:ilvl="0">
+      <w:start w:val="1"/>
+      <w:numFmt w:val="bullet"/>
+      <w:lvlText w:val=""/>
+      <w:lvlJc w:val="left"/>
+      <w:pPr>
+        <w:tabs>
+          <w:tab w:val="num" w:pos="720"/>
+        </w:tabs>
+        <w:ind w:left="720" w:hanging="360"/>
+      </w:pPr>
+      <w:rPr>
+        <w:rFonts w:ascii="Symbol" w:hAnsi="Symbol" w:hint="default"/>
+        <w:sz w:val="20"/>
+      </w:rPr>
+    </w:lvl>
+    <w:lvl w:ilvl="1" w:tentative="1">
+      <w:start w:val="1"/>
+      <w:numFmt w:val="bullet"/>
+      <w:lvlText w:val="o"/>
+      <w:lvlJc w:val="left"/>
+      <w:pPr>
+        <w:tabs>
+          <w:tab w:val="num" w:pos="1440"/>
+        </w:tabs>
+        <w:ind w:left="1440" w:hanging="360"/>
+      </w:pPr>
+      <w:rPr>
+        <w:rFonts w:ascii="Courier New" w:hAnsi="Courier New" w:hint="default"/>
+        <w:sz w:val="20"/>
+      </w:rPr>
+    </w:lvl>
+    <w:lvl w:ilvl="2" w:tentative="1">
+      <w:start w:val="1"/>
+      <w:numFmt w:val="bullet"/>
+      <w:lvlText w:val=""/>
+      <w:lvlJc w:val="left"/>
+      <w:pPr>
+        <w:tabs>
+          <w:tab w:val="num" w:pos="2160"/>
+        </w:tabs>
+        <w:ind w:left="2160" w:hanging="360"/>
+      </w:pPr>
+      <w:rPr>
+        <w:rFonts w:ascii="Wingdings" w:hAnsi="Wingdings" w:hint="default"/>
+        <w:sz w:val="20"/>
+      </w:rPr>
+    </w:lvl>
+    <w:lvl w:ilvl="3" w:tentative="1">
+      <w:start w:val="1"/>
+      <w:numFmt w:val="bullet"/>
+      <w:lvlText w:val=""/>
+      <w:lvlJc w:val="left"/>
+      <w:pPr>
+        <w:tabs>
+          <w:tab w:val="num" w:pos="2880"/>
+        </w:tabs>
+        <w:ind w:left="2880" w:hanging="360"/>
+      </w:pPr>
+      <w:rPr>
+        <w:rFonts w:ascii="Wingdings" w:hAnsi="Wingdings" w:hint="default"/>
+        <w:sz w:val="20"/>
+      </w:rPr>
+    </w:lvl>
+    <w:lvl w:ilvl="4" w:tentative="1">
+      <w:start w:val="1"/>
+      <w:numFmt w:val="bullet"/>
+      <w:lvlText w:val=""/>
+      <w:lvlJc w:val="left"/>
+      <w:pPr>
+        <w:tabs>
+          <w:tab w:val="num" w:pos="3600"/>
+        </w:tabs>
+        <w:ind w:left="3600" w:hanging="360"/>
+      </w:pPr>
+      <w:rPr>
+        <w:rFonts w:ascii="Wingdings" w:hAnsi="Wingdings" w:hint="default"/>
+        <w:sz w:val="20"/>
+      </w:rPr>
+    </w:lvl>
+    <w:lvl w:ilvl="5" w:tentative="1">
+      <w:start w:val="1"/>
+      <w:numFmt w:val="bullet"/>
+      <w:lvlText w:val=""/>
+      <w:lvlJc w:val="left"/>
+      <w:pPr>
+        <w:tabs>
+          <w:tab w:val="num" w:pos="4320"/>
+        </w:tabs>
+        <w:ind w:left="4320" w:hanging="360"/>
+      </w:pPr>
+      <w:rPr>
+        <w:rFonts w:ascii="Wingdings" w:hAnsi="Wingdings" w:hint="default"/>
+        <w:sz w:val="20"/>
+      </w:rPr>
+    </w:lvl>
+    <w:lvl w:ilvl="6" w:tentative="1">
+      <w:start w:val="1"/>
+      <w:numFmt w:val="bullet"/>
+      <w:lvlText w:val=""/>
+      <w:lvlJc w:val="left"/>
+      <w:pPr>
+        <w:tabs>
+          <w:tab w:val="num" w:pos="5040"/>
+        </w:tabs>
+        <w:ind w:left="5040" w:hanging="360"/>
+      </w:pPr>
+      <w:rPr>
+        <w:rFonts w:ascii="Wingdings" w:hAnsi="Wingdings" w:hint="default"/>
+        <w:sz w:val="20"/>
+      </w:rPr>
+    </w:lvl>
+    <w:lvl w:ilvl="7" w:tentative="1">
+      <w:start w:val="1"/>
+      <w:numFmt w:val="bullet"/>
+      <w:lvlText w:val=""/>
+      <w:lvlJc w:val="left"/>
+      <w:pPr>
+        <w:tabs>
+          <w:tab w:val="num" w:pos="5760"/>
+        </w:tabs>
+        <w:ind w:left="5760" w:hanging="360"/>
+      </w:pPr>
+      <w:rPr>
+        <w:rFonts w:ascii="Wingdings" w:hAnsi="Wingdings" w:hint="default"/>
+        <w:sz w:val="20"/>
+      </w:rPr>
+    </w:lvl>
+    <w:lvl w:ilvl="8" w:tentative="1">
+      <w:start w:val="1"/>
+      <w:numFmt w:val="bullet"/>
+      <w:lvlText w:val=""/>
+      <w:lvlJc w:val="left"/>
+      <w:pPr>
+        <w:tabs>
+          <w:tab w:val="num" w:pos="6480"/>
+        </w:tabs>
+        <w:ind w:left="6480" w:hanging="360"/>
+      </w:pPr>
+      <w:rPr>
+        <w:rFonts w:ascii="Wingdings" w:hAnsi="Wingdings" w:hint="default"/>
+        <w:sz w:val="20"/>
+      </w:rPr>
+    </w:lvl>
+  </w:abstractNum>
+  <w:abstractNum w:abstractNumId="23" w15:restartNumberingAfterBreak="0">
     <w:nsid w:val="3FA857AB"/>
     <w:multiLevelType w:val="multilevel"/>
     <w:tmpl w:val="E8709388"/>
@@ -4266,7 +5671,7 @@
       </w:rPr>
     </w:lvl>
   </w:abstractNum>
-  <w:abstractNum w:abstractNumId="18" w15:restartNumberingAfterBreak="0">
+  <w:abstractNum w:abstractNumId="24" w15:restartNumberingAfterBreak="0">
     <w:nsid w:val="487D17E3"/>
     <w:multiLevelType w:val="multilevel"/>
     <w:tmpl w:val="29BC67E8"/>
@@ -4415,7 +5820,7 @@
       </w:rPr>
     </w:lvl>
   </w:abstractNum>
-  <w:abstractNum w:abstractNumId="19" w15:restartNumberingAfterBreak="0">
+  <w:abstractNum w:abstractNumId="25" w15:restartNumberingAfterBreak="0">
     <w:nsid w:val="4BF542EF"/>
     <w:multiLevelType w:val="hybridMultilevel"/>
     <w:tmpl w:val="0C9E8608"/>
@@ -4528,7 +5933,7 @@
       </w:rPr>
     </w:lvl>
   </w:abstractNum>
-  <w:abstractNum w:abstractNumId="20" w15:restartNumberingAfterBreak="0">
+  <w:abstractNum w:abstractNumId="26" w15:restartNumberingAfterBreak="0">
     <w:nsid w:val="4F524A7D"/>
     <w:multiLevelType w:val="hybridMultilevel"/>
     <w:tmpl w:val="200A8ABC"/>
@@ -4643,7 +6048,7 @@
       </w:rPr>
     </w:lvl>
   </w:abstractNum>
-  <w:abstractNum w:abstractNumId="21" w15:restartNumberingAfterBreak="0">
+  <w:abstractNum w:abstractNumId="27" w15:restartNumberingAfterBreak="0">
     <w:nsid w:val="50220138"/>
     <w:multiLevelType w:val="hybridMultilevel"/>
     <w:tmpl w:val="E4A40732"/>
@@ -4756,7 +6161,156 @@
       </w:rPr>
     </w:lvl>
   </w:abstractNum>
-  <w:abstractNum w:abstractNumId="22" w15:restartNumberingAfterBreak="0">
+  <w:abstractNum w:abstractNumId="28" w15:restartNumberingAfterBreak="0">
+    <w:nsid w:val="50F32E03"/>
+    <w:multiLevelType w:val="multilevel"/>
+    <w:tmpl w:val="C840F0D0"/>
+    <w:lvl w:ilvl="0">
+      <w:start w:val="1"/>
+      <w:numFmt w:val="bullet"/>
+      <w:lvlText w:val=""/>
+      <w:lvlJc w:val="left"/>
+      <w:pPr>
+        <w:tabs>
+          <w:tab w:val="num" w:pos="720"/>
+        </w:tabs>
+        <w:ind w:left="720" w:hanging="360"/>
+      </w:pPr>
+      <w:rPr>
+        <w:rFonts w:ascii="Symbol" w:hAnsi="Symbol" w:hint="default"/>
+        <w:sz w:val="20"/>
+      </w:rPr>
+    </w:lvl>
+    <w:lvl w:ilvl="1" w:tentative="1">
+      <w:start w:val="1"/>
+      <w:numFmt w:val="bullet"/>
+      <w:lvlText w:val="o"/>
+      <w:lvlJc w:val="left"/>
+      <w:pPr>
+        <w:tabs>
+          <w:tab w:val="num" w:pos="1440"/>
+        </w:tabs>
+        <w:ind w:left="1440" w:hanging="360"/>
+      </w:pPr>
+      <w:rPr>
+        <w:rFonts w:ascii="Courier New" w:hAnsi="Courier New" w:hint="default"/>
+        <w:sz w:val="20"/>
+      </w:rPr>
+    </w:lvl>
+    <w:lvl w:ilvl="2" w:tentative="1">
+      <w:start w:val="1"/>
+      <w:numFmt w:val="bullet"/>
+      <w:lvlText w:val=""/>
+      <w:lvlJc w:val="left"/>
+      <w:pPr>
+        <w:tabs>
+          <w:tab w:val="num" w:pos="2160"/>
+        </w:tabs>
+        <w:ind w:left="2160" w:hanging="360"/>
+      </w:pPr>
+      <w:rPr>
+        <w:rFonts w:ascii="Wingdings" w:hAnsi="Wingdings" w:hint="default"/>
+        <w:sz w:val="20"/>
+      </w:rPr>
+    </w:lvl>
+    <w:lvl w:ilvl="3" w:tentative="1">
+      <w:start w:val="1"/>
+      <w:numFmt w:val="bullet"/>
+      <w:lvlText w:val=""/>
+      <w:lvlJc w:val="left"/>
+      <w:pPr>
+        <w:tabs>
+          <w:tab w:val="num" w:pos="2880"/>
+        </w:tabs>
+        <w:ind w:left="2880" w:hanging="360"/>
+      </w:pPr>
+      <w:rPr>
+        <w:rFonts w:ascii="Wingdings" w:hAnsi="Wingdings" w:hint="default"/>
+        <w:sz w:val="20"/>
+      </w:rPr>
+    </w:lvl>
+    <w:lvl w:ilvl="4" w:tentative="1">
+      <w:start w:val="1"/>
+      <w:numFmt w:val="bullet"/>
+      <w:lvlText w:val=""/>
+      <w:lvlJc w:val="left"/>
+      <w:pPr>
+        <w:tabs>
+          <w:tab w:val="num" w:pos="3600"/>
+        </w:tabs>
+        <w:ind w:left="3600" w:hanging="360"/>
+      </w:pPr>
+      <w:rPr>
+        <w:rFonts w:ascii="Wingdings" w:hAnsi="Wingdings" w:hint="default"/>
+        <w:sz w:val="20"/>
+      </w:rPr>
+    </w:lvl>
+    <w:lvl w:ilvl="5" w:tentative="1">
+      <w:start w:val="1"/>
+      <w:numFmt w:val="bullet"/>
+      <w:lvlText w:val=""/>
+      <w:lvlJc w:val="left"/>
+      <w:pPr>
+        <w:tabs>
+          <w:tab w:val="num" w:pos="4320"/>
+        </w:tabs>
+        <w:ind w:left="4320" w:hanging="360"/>
+      </w:pPr>
+      <w:rPr>
+        <w:rFonts w:ascii="Wingdings" w:hAnsi="Wingdings" w:hint="default"/>
+        <w:sz w:val="20"/>
+      </w:rPr>
+    </w:lvl>
+    <w:lvl w:ilvl="6" w:tentative="1">
+      <w:start w:val="1"/>
+      <w:numFmt w:val="bullet"/>
+      <w:lvlText w:val=""/>
+      <w:lvlJc w:val="left"/>
+      <w:pPr>
+        <w:tabs>
+          <w:tab w:val="num" w:pos="5040"/>
+        </w:tabs>
+        <w:ind w:left="5040" w:hanging="360"/>
+      </w:pPr>
+      <w:rPr>
+        <w:rFonts w:ascii="Wingdings" w:hAnsi="Wingdings" w:hint="default"/>
+        <w:sz w:val="20"/>
+      </w:rPr>
+    </w:lvl>
+    <w:lvl w:ilvl="7" w:tentative="1">
+      <w:start w:val="1"/>
+      <w:numFmt w:val="bullet"/>
+      <w:lvlText w:val=""/>
+      <w:lvlJc w:val="left"/>
+      <w:pPr>
+        <w:tabs>
+          <w:tab w:val="num" w:pos="5760"/>
+        </w:tabs>
+        <w:ind w:left="5760" w:hanging="360"/>
+      </w:pPr>
+      <w:rPr>
+        <w:rFonts w:ascii="Wingdings" w:hAnsi="Wingdings" w:hint="default"/>
+        <w:sz w:val="20"/>
+      </w:rPr>
+    </w:lvl>
+    <w:lvl w:ilvl="8" w:tentative="1">
+      <w:start w:val="1"/>
+      <w:numFmt w:val="bullet"/>
+      <w:lvlText w:val=""/>
+      <w:lvlJc w:val="left"/>
+      <w:pPr>
+        <w:tabs>
+          <w:tab w:val="num" w:pos="6480"/>
+        </w:tabs>
+        <w:ind w:left="6480" w:hanging="360"/>
+      </w:pPr>
+      <w:rPr>
+        <w:rFonts w:ascii="Wingdings" w:hAnsi="Wingdings" w:hint="default"/>
+        <w:sz w:val="20"/>
+      </w:rPr>
+    </w:lvl>
+  </w:abstractNum>
+  <w:abstractNum w:abstractNumId="29" w15:restartNumberingAfterBreak="0">
     <w:nsid w:val="57EB2062"/>
     <w:multiLevelType w:val="hybridMultilevel"/>
     <w:tmpl w:val="15A600B4"/>
@@ -4869,7 +6423,7 @@
       </w:rPr>
     </w:lvl>
   </w:abstractNum>
-  <w:abstractNum w:abstractNumId="23" w15:restartNumberingAfterBreak="0">
+  <w:abstractNum w:abstractNumId="30" w15:restartNumberingAfterBreak="0">
     <w:nsid w:val="58C26489"/>
     <w:multiLevelType w:val="multilevel"/>
     <w:tmpl w:val="49BC0CBC"/>
@@ -4982,7 +6536,7 @@
       </w:pPr>
     </w:lvl>
   </w:abstractNum>
-  <w:abstractNum w:abstractNumId="24" w15:restartNumberingAfterBreak="0">
+  <w:abstractNum w:abstractNumId="31" w15:restartNumberingAfterBreak="0">
     <w:nsid w:val="59B65793"/>
     <w:multiLevelType w:val="multilevel"/>
     <w:tmpl w:val="BDF63A78"/>
@@ -5131,7 +6685,7 @@
       </w:rPr>
     </w:lvl>
   </w:abstractNum>
-  <w:abstractNum w:abstractNumId="25" w15:restartNumberingAfterBreak="0">
+  <w:abstractNum w:abstractNumId="32" w15:restartNumberingAfterBreak="0">
     <w:nsid w:val="5BA1056E"/>
     <w:multiLevelType w:val="hybridMultilevel"/>
     <w:tmpl w:val="5DC85F8C"/>
@@ -5246,7 +6800,7 @@
       </w:rPr>
     </w:lvl>
   </w:abstractNum>
-  <w:abstractNum w:abstractNumId="26" w15:restartNumberingAfterBreak="0">
+  <w:abstractNum w:abstractNumId="33" w15:restartNumberingAfterBreak="0">
     <w:nsid w:val="5C8A6402"/>
     <w:multiLevelType w:val="hybridMultilevel"/>
     <w:tmpl w:val="E21CE8AE"/>
@@ -5359,7 +6913,7 @@
       </w:rPr>
     </w:lvl>
   </w:abstractNum>
-  <w:abstractNum w:abstractNumId="27" w15:restartNumberingAfterBreak="0">
+  <w:abstractNum w:abstractNumId="34" w15:restartNumberingAfterBreak="0">
     <w:nsid w:val="63975D90"/>
     <w:multiLevelType w:val="multilevel"/>
     <w:tmpl w:val="57B669C2"/>
@@ -5475,7 +7029,7 @@
       </w:pPr>
     </w:lvl>
   </w:abstractNum>
-  <w:abstractNum w:abstractNumId="28" w15:restartNumberingAfterBreak="0">
+  <w:abstractNum w:abstractNumId="35" w15:restartNumberingAfterBreak="0">
     <w:nsid w:val="64F43EC3"/>
     <w:multiLevelType w:val="hybridMultilevel"/>
     <w:tmpl w:val="DA34AC0E"/>
@@ -5590,7 +7144,7 @@
       </w:rPr>
     </w:lvl>
   </w:abstractNum>
-  <w:abstractNum w:abstractNumId="29" w15:restartNumberingAfterBreak="0">
+  <w:abstractNum w:abstractNumId="36" w15:restartNumberingAfterBreak="0">
     <w:nsid w:val="68CB777A"/>
     <w:multiLevelType w:val="multilevel"/>
     <w:tmpl w:val="B58072C8"/>
@@ -5739,7 +7293,7 @@
       </w:rPr>
     </w:lvl>
   </w:abstractNum>
-  <w:abstractNum w:abstractNumId="30" w15:restartNumberingAfterBreak="0">
+  <w:abstractNum w:abstractNumId="37" w15:restartNumberingAfterBreak="0">
     <w:nsid w:val="6AFC0EC4"/>
     <w:multiLevelType w:val="hybridMultilevel"/>
     <w:tmpl w:val="5EE4C406"/>
@@ -5852,7 +7406,7 @@
       </w:rPr>
     </w:lvl>
   </w:abstractNum>
-  <w:abstractNum w:abstractNumId="31" w15:restartNumberingAfterBreak="0">
+  <w:abstractNum w:abstractNumId="38" w15:restartNumberingAfterBreak="0">
     <w:nsid w:val="6FBF3492"/>
     <w:multiLevelType w:val="multilevel"/>
     <w:tmpl w:val="1A5E0FD0"/>
@@ -6001,7 +7555,7 @@
       </w:rPr>
     </w:lvl>
   </w:abstractNum>
-  <w:abstractNum w:abstractNumId="32" w15:restartNumberingAfterBreak="0">
+  <w:abstractNum w:abstractNumId="39" w15:restartNumberingAfterBreak="0">
     <w:nsid w:val="76D1102B"/>
     <w:multiLevelType w:val="multilevel"/>
     <w:tmpl w:val="D64000F6"/>
@@ -6150,7 +7704,7 @@
       </w:rPr>
     </w:lvl>
   </w:abstractNum>
-  <w:abstractNum w:abstractNumId="33" w15:restartNumberingAfterBreak="0">
+  <w:abstractNum w:abstractNumId="40" w15:restartNumberingAfterBreak="0">
     <w:nsid w:val="79D41F5A"/>
     <w:multiLevelType w:val="multilevel"/>
     <w:tmpl w:val="E1A07C7A"/>
@@ -6300,106 +7854,127 @@
     </w:lvl>
   </w:abstractNum>
   <w:num w:numId="1" w16cid:durableId="1730809420">
+    <w:abstractNumId w:val="15"/>
+  </w:num>
+  <w:num w:numId="2" w16cid:durableId="1322849754">
+    <w:abstractNumId w:val="6"/>
+  </w:num>
+  <w:num w:numId="3" w16cid:durableId="2054848097">
     <w:abstractNumId w:val="11"/>
   </w:num>
-  <w:num w:numId="2" w16cid:durableId="1322849754">
+  <w:num w:numId="4" w16cid:durableId="1939098821">
+    <w:abstractNumId w:val="29"/>
+  </w:num>
+  <w:num w:numId="5" w16cid:durableId="526793128">
+    <w:abstractNumId w:val="21"/>
+  </w:num>
+  <w:num w:numId="6" w16cid:durableId="1084955616">
     <w:abstractNumId w:val="4"/>
   </w:num>
-  <w:num w:numId="3" w16cid:durableId="2054848097">
-    <w:abstractNumId w:val="8"/>
-  </w:num>
-  <w:num w:numId="4" w16cid:durableId="1939098821">
-    <w:abstractNumId w:val="22"/>
-  </w:num>
-  <w:num w:numId="5" w16cid:durableId="526793128">
-    <w:abstractNumId w:val="16"/>
-  </w:num>
-  <w:num w:numId="6" w16cid:durableId="1084955616">
-    <w:abstractNumId w:val="3"/>
-  </w:num>
   <w:num w:numId="7" w16cid:durableId="1635405010">
-    <w:abstractNumId w:val="30"/>
+    <w:abstractNumId w:val="37"/>
   </w:num>
   <w:num w:numId="8" w16cid:durableId="645627089">
-    <w:abstractNumId w:val="27"/>
+    <w:abstractNumId w:val="34"/>
   </w:num>
   <w:num w:numId="9" w16cid:durableId="881479079">
-    <w:abstractNumId w:val="21"/>
+    <w:abstractNumId w:val="27"/>
   </w:num>
   <w:num w:numId="10" w16cid:durableId="1316764188">
     <w:abstractNumId w:val="0"/>
   </w:num>
   <w:num w:numId="11" w16cid:durableId="1993018345">
-    <w:abstractNumId w:val="23"/>
+    <w:abstractNumId w:val="30"/>
   </w:num>
   <w:num w:numId="12" w16cid:durableId="2004427800">
+    <w:abstractNumId w:val="33"/>
+  </w:num>
+  <w:num w:numId="13" w16cid:durableId="1760175939">
+    <w:abstractNumId w:val="17"/>
+  </w:num>
+  <w:num w:numId="14" w16cid:durableId="2055809945">
     <w:abstractNumId w:val="26"/>
   </w:num>
-  <w:num w:numId="13" w16cid:durableId="1760175939">
-    <w:abstractNumId w:val="13"/>
-  </w:num>
-  <w:num w:numId="14" w16cid:durableId="2055809945">
-    <w:abstractNumId w:val="20"/>
-  </w:num>
   <w:num w:numId="15" w16cid:durableId="1871720275">
-    <w:abstractNumId w:val="29"/>
+    <w:abstractNumId w:val="36"/>
   </w:num>
   <w:num w:numId="16" w16cid:durableId="1380740809">
-    <w:abstractNumId w:val="28"/>
+    <w:abstractNumId w:val="35"/>
   </w:num>
   <w:num w:numId="17" w16cid:durableId="208030758">
+    <w:abstractNumId w:val="38"/>
+  </w:num>
+  <w:num w:numId="18" w16cid:durableId="858543355">
+    <w:abstractNumId w:val="8"/>
+  </w:num>
+  <w:num w:numId="19" w16cid:durableId="848180052">
     <w:abstractNumId w:val="31"/>
   </w:num>
-  <w:num w:numId="18" w16cid:durableId="858543355">
-    <w:abstractNumId w:val="6"/>
-  </w:num>
-  <w:num w:numId="19" w16cid:durableId="848180052">
+  <w:num w:numId="20" w16cid:durableId="1134952874">
     <w:abstractNumId w:val="24"/>
   </w:num>
-  <w:num w:numId="20" w16cid:durableId="1134952874">
-    <w:abstractNumId w:val="18"/>
-  </w:num>
   <w:num w:numId="21" w16cid:durableId="1669864989">
-    <w:abstractNumId w:val="5"/>
+    <w:abstractNumId w:val="7"/>
   </w:num>
   <w:num w:numId="22" w16cid:durableId="668139908">
-    <w:abstractNumId w:val="32"/>
+    <w:abstractNumId w:val="39"/>
   </w:num>
   <w:num w:numId="23" w16cid:durableId="1755082962">
     <w:abstractNumId w:val="1"/>
   </w:num>
   <w:num w:numId="24" w16cid:durableId="1150361666">
-    <w:abstractNumId w:val="19"/>
+    <w:abstractNumId w:val="25"/>
   </w:num>
   <w:num w:numId="25" w16cid:durableId="1840730934">
     <w:abstractNumId w:val="2"/>
   </w:num>
   <w:num w:numId="26" w16cid:durableId="728379270">
-    <w:abstractNumId w:val="25"/>
+    <w:abstractNumId w:val="32"/>
   </w:num>
   <w:num w:numId="27" w16cid:durableId="1336759409">
-    <w:abstractNumId w:val="15"/>
+    <w:abstractNumId w:val="19"/>
   </w:num>
   <w:num w:numId="28" w16cid:durableId="2125078277">
+    <w:abstractNumId w:val="18"/>
+  </w:num>
+  <w:num w:numId="29" w16cid:durableId="137841461">
+    <w:abstractNumId w:val="16"/>
+  </w:num>
+  <w:num w:numId="30" w16cid:durableId="1234900473">
+    <w:abstractNumId w:val="12"/>
+  </w:num>
+  <w:num w:numId="31" w16cid:durableId="1960912510">
+    <w:abstractNumId w:val="40"/>
+  </w:num>
+  <w:num w:numId="32" w16cid:durableId="369696523">
+    <w:abstractNumId w:val="13"/>
+  </w:num>
+  <w:num w:numId="33" w16cid:durableId="891962246">
+    <w:abstractNumId w:val="23"/>
+  </w:num>
+  <w:num w:numId="34" w16cid:durableId="1820803005">
+    <w:abstractNumId w:val="9"/>
+  </w:num>
+  <w:num w:numId="35" w16cid:durableId="234751098">
+    <w:abstractNumId w:val="5"/>
+  </w:num>
+  <w:num w:numId="36" w16cid:durableId="1716930089">
+    <w:abstractNumId w:val="22"/>
+  </w:num>
+  <w:num w:numId="37" w16cid:durableId="1872380866">
+    <w:abstractNumId w:val="28"/>
+  </w:num>
+  <w:num w:numId="38" w16cid:durableId="955674944">
+    <w:abstractNumId w:val="20"/>
+  </w:num>
+  <w:num w:numId="39" w16cid:durableId="1441143319">
     <w:abstractNumId w:val="14"/>
   </w:num>
-  <w:num w:numId="29" w16cid:durableId="137841461">
-    <w:abstractNumId w:val="12"/>
-  </w:num>
-  <w:num w:numId="30" w16cid:durableId="1234900473">
-    <w:abstractNumId w:val="9"/>
-  </w:num>
-  <w:num w:numId="31" w16cid:durableId="1960912510">
-    <w:abstractNumId w:val="33"/>
-  </w:num>
-  <w:num w:numId="32" w16cid:durableId="369696523">
+  <w:num w:numId="40" w16cid:durableId="1451627165">
     <w:abstractNumId w:val="10"/>
   </w:num>
-  <w:num w:numId="33" w16cid:durableId="891962246">
-    <w:abstractNumId w:val="17"/>
-  </w:num>
-  <w:num w:numId="34" w16cid:durableId="1820803005">
-    <w:abstractNumId w:val="7"/>
+  <w:num w:numId="41" w16cid:durableId="2021424746">
+    <w:abstractNumId w:val="3"/>
   </w:num>
 </w:numbering>
 </file>

</xml_diff>